<commit_message>
Update data weighting diagnostics and length export
</commit_message>
<xml_diff>
--- a/doc/NewLengthFreq.docx
+++ b/doc/NewLengthFreq.docx
@@ -1845,6 +1845,18 @@
         <w:rPr>
           <w:rStyle w:val="StringTok"/>
         </w:rPr>
+        <w:t xml:space="preserve">"OMMP16"</w:t>
+      </w:r>
+      <w:r>
+        <w:rPr>
+          <w:rStyle w:val="NormalTok"/>
+        </w:rPr>
+        <w:t xml:space="preserve">, </w:t>
+      </w:r>
+      <w:r>
+        <w:rPr>
+          <w:rStyle w:val="StringTok"/>
+        </w:rPr>
         <w:t xml:space="preserve">"csv_2026"</w:t>
       </w:r>
       <w:r>
@@ -1964,7 +1976,7 @@
         <w:pStyle w:val="FirstParagraph"/>
       </w:pPr>
       <w:r>
-        <w:t xml:space="preserve">The Japanese size data currently loaded from /Users/jim/_mymods/CCSBT/sbt_2026/OMMP16/doc/JP_Size_Age4plus.csv run through 2025. The GAM CPUE data currently loaded from /Users/jim/_mymods/CCSBT/sbt_2026/OMMP16/doc/MeanPredictGAM2022_YMLL.csv run through 2025, so the joined GAM-weighted estimates run through 2025. The assessment length-frequency data loaded from /Users/jim/_mymods/CCSBT/sbt_2026/OMMP16/csv_2026/length_freq.csv run through 2025.</w:t>
+        <w:t xml:space="preserve">The Japanese size data currently loaded from /Users/jim/_mymods/CCSBT/sbt_2026/doc/JP_Size_Age4plus.csv run through 2025. The GAM CPUE data currently loaded from /Users/jim/_mymods/CCSBT/sbt_2026/doc/MeanPredictGAM2022_YMLL.csv run through 2025, so the joined GAM-weighted estimates run through 2025. The assessment length-frequency data loaded from /Users/jim/_mymods/CCSBT/sbt_2026/OMMP16/csv_2026/length_freq.csv run through 2025.</w:t>
       </w:r>
     </w:p>
     <w:bookmarkStart w:id="10" w:name="spatial-adjustments-and-filtering"/>
@@ -2733,7 +2745,7 @@
     </w:p>
     <w:bookmarkEnd w:id="12"/>
     <w:bookmarkEnd w:id="13"/>
-    <w:bookmarkStart w:id="28" w:name="Xa202d986fef366a444d1c8706681544dcb2e793"/>
+    <w:bookmarkStart w:id="29" w:name="Xa202d986fef366a444d1c8706681544dcb2e793"/>
     <w:p>
       <w:pPr>
         <w:pStyle w:val="Heading1"/>
@@ -5556,7 +5568,7 @@
       </w:r>
     </w:p>
     <w:bookmarkEnd w:id="18"/>
-    <w:bookmarkStart w:id="27" w:name="X33e488c98e0d2464350a8aea6828c5673e6757e"/>
+    <w:bookmarkStart w:id="28" w:name="X33e488c98e0d2464350a8aea6828c5673e6757e"/>
     <w:p>
       <w:pPr>
         <w:pStyle w:val="Heading2"/>
@@ -5769,6 +5781,951 @@
           <w:rStyle w:val="NormalTok"/>
         </w:rPr>
         <w:t xml:space="preserve">  )</w:t>
+      </w:r>
+      <w:r>
+        <w:br/>
+      </w:r>
+      <w:r>
+        <w:br/>
+      </w:r>
+      <w:r>
+        <w:rPr>
+          <w:rStyle w:val="NormalTok"/>
+        </w:rPr>
+        <w:t xml:space="preserve">sbt_length_bins </w:t>
+      </w:r>
+      <w:r>
+        <w:rPr>
+          <w:rStyle w:val="OtherTok"/>
+        </w:rPr>
+        <w:t xml:space="preserve">&lt;-</w:t>
+      </w:r>
+      <w:r>
+        <w:rPr>
+          <w:rStyle w:val="NormalTok"/>
+        </w:rPr>
+        <w:t xml:space="preserve"> </w:t>
+      </w:r>
+      <w:r>
+        <w:rPr>
+          <w:rStyle w:val="FunctionTok"/>
+        </w:rPr>
+        <w:t xml:space="preserve">as.character</w:t>
+      </w:r>
+      <w:r>
+        <w:rPr>
+          <w:rStyle w:val="NormalTok"/>
+        </w:rPr>
+        <w:t xml:space="preserve">(</w:t>
+      </w:r>
+      <w:r>
+        <w:rPr>
+          <w:rStyle w:val="FunctionTok"/>
+        </w:rPr>
+        <w:t xml:space="preserve">seq</w:t>
+      </w:r>
+      <w:r>
+        <w:rPr>
+          <w:rStyle w:val="NormalTok"/>
+        </w:rPr>
+        <w:t xml:space="preserve">(</w:t>
+      </w:r>
+      <w:r>
+        <w:rPr>
+          <w:rStyle w:val="DecValTok"/>
+        </w:rPr>
+        <w:t xml:space="preserve">32</w:t>
+      </w:r>
+      <w:r>
+        <w:rPr>
+          <w:rStyle w:val="NormalTok"/>
+        </w:rPr>
+        <w:t xml:space="preserve">, </w:t>
+      </w:r>
+      <w:r>
+        <w:rPr>
+          <w:rStyle w:val="DecValTok"/>
+        </w:rPr>
+        <w:t xml:space="preserve">250</w:t>
+      </w:r>
+      <w:r>
+        <w:rPr>
+          <w:rStyle w:val="NormalTok"/>
+        </w:rPr>
+        <w:t xml:space="preserve">, </w:t>
+      </w:r>
+      <w:r>
+        <w:rPr>
+          <w:rStyle w:val="AttributeTok"/>
+        </w:rPr>
+        <w:t xml:space="preserve">by =</w:t>
+      </w:r>
+      <w:r>
+        <w:rPr>
+          <w:rStyle w:val="NormalTok"/>
+        </w:rPr>
+        <w:t xml:space="preserve"> </w:t>
+      </w:r>
+      <w:r>
+        <w:rPr>
+          <w:rStyle w:val="DecValTok"/>
+        </w:rPr>
+        <w:t xml:space="preserve">2</w:t>
+      </w:r>
+      <w:r>
+        <w:rPr>
+          <w:rStyle w:val="NormalTok"/>
+        </w:rPr>
+        <w:t xml:space="preserve">))</w:t>
+      </w:r>
+      <w:r>
+        <w:br/>
+      </w:r>
+      <w:r>
+        <w:rPr>
+          <w:rStyle w:val="NormalTok"/>
+        </w:rPr>
+        <w:t xml:space="preserve">lf_gam_sbt_wide </w:t>
+      </w:r>
+      <w:r>
+        <w:rPr>
+          <w:rStyle w:val="OtherTok"/>
+        </w:rPr>
+        <w:t xml:space="preserve">&lt;-</w:t>
+      </w:r>
+      <w:r>
+        <w:rPr>
+          <w:rStyle w:val="NormalTok"/>
+        </w:rPr>
+        <w:t xml:space="preserve"> lf_gam </w:t>
+      </w:r>
+      <w:r>
+        <w:rPr>
+          <w:rStyle w:val="SpecialCharTok"/>
+        </w:rPr>
+        <w:t xml:space="preserve">|&gt;</w:t>
+      </w:r>
+      <w:r>
+        <w:br/>
+      </w:r>
+      <w:r>
+        <w:rPr>
+          <w:rStyle w:val="NormalTok"/>
+        </w:rPr>
+        <w:t xml:space="preserve">  </w:t>
+      </w:r>
+      <w:r>
+        <w:rPr>
+          <w:rStyle w:val="FunctionTok"/>
+        </w:rPr>
+        <w:t xml:space="preserve">mutate</w:t>
+      </w:r>
+      <w:r>
+        <w:rPr>
+          <w:rStyle w:val="NormalTok"/>
+        </w:rPr>
+        <w:t xml:space="preserve">(</w:t>
+      </w:r>
+      <w:r>
+        <w:rPr>
+          <w:rStyle w:val="AttributeTok"/>
+        </w:rPr>
+        <w:t xml:space="preserve">length_bin =</w:t>
+      </w:r>
+      <w:r>
+        <w:rPr>
+          <w:rStyle w:val="NormalTok"/>
+        </w:rPr>
+        <w:t xml:space="preserve"> </w:t>
+      </w:r>
+      <w:r>
+        <w:rPr>
+          <w:rStyle w:val="FunctionTok"/>
+        </w:rPr>
+        <w:t xml:space="preserve">pmin</w:t>
+      </w:r>
+      <w:r>
+        <w:rPr>
+          <w:rStyle w:val="NormalTok"/>
+        </w:rPr>
+        <w:t xml:space="preserve">(</w:t>
+      </w:r>
+      <w:r>
+        <w:rPr>
+          <w:rStyle w:val="FunctionTok"/>
+        </w:rPr>
+        <w:t xml:space="preserve">pmax</w:t>
+      </w:r>
+      <w:r>
+        <w:rPr>
+          <w:rStyle w:val="NormalTok"/>
+        </w:rPr>
+        <w:t xml:space="preserve">(length_bin, </w:t>
+      </w:r>
+      <w:r>
+        <w:rPr>
+          <w:rStyle w:val="DecValTok"/>
+        </w:rPr>
+        <w:t xml:space="preserve">32</w:t>
+      </w:r>
+      <w:r>
+        <w:rPr>
+          <w:rStyle w:val="NormalTok"/>
+        </w:rPr>
+        <w:t xml:space="preserve">), </w:t>
+      </w:r>
+      <w:r>
+        <w:rPr>
+          <w:rStyle w:val="DecValTok"/>
+        </w:rPr>
+        <w:t xml:space="preserve">250</w:t>
+      </w:r>
+      <w:r>
+        <w:rPr>
+          <w:rStyle w:val="NormalTok"/>
+        </w:rPr>
+        <w:t xml:space="preserve">)) </w:t>
+      </w:r>
+      <w:r>
+        <w:rPr>
+          <w:rStyle w:val="SpecialCharTok"/>
+        </w:rPr>
+        <w:t xml:space="preserve">|&gt;</w:t>
+      </w:r>
+      <w:r>
+        <w:br/>
+      </w:r>
+      <w:r>
+        <w:rPr>
+          <w:rStyle w:val="NormalTok"/>
+        </w:rPr>
+        <w:t xml:space="preserve">  </w:t>
+      </w:r>
+      <w:r>
+        <w:rPr>
+          <w:rStyle w:val="FunctionTok"/>
+        </w:rPr>
+        <w:t xml:space="preserve">group_by</w:t>
+      </w:r>
+      <w:r>
+        <w:rPr>
+          <w:rStyle w:val="NormalTok"/>
+        </w:rPr>
+        <w:t xml:space="preserve">(year, length_bin) </w:t>
+      </w:r>
+      <w:r>
+        <w:rPr>
+          <w:rStyle w:val="SpecialCharTok"/>
+        </w:rPr>
+        <w:t xml:space="preserve">|&gt;</w:t>
+      </w:r>
+      <w:r>
+        <w:br/>
+      </w:r>
+      <w:r>
+        <w:rPr>
+          <w:rStyle w:val="NormalTok"/>
+        </w:rPr>
+        <w:t xml:space="preserve">  </w:t>
+      </w:r>
+      <w:r>
+        <w:rPr>
+          <w:rStyle w:val="FunctionTok"/>
+        </w:rPr>
+        <w:t xml:space="preserve">summarise</w:t>
+      </w:r>
+      <w:r>
+        <w:rPr>
+          <w:rStyle w:val="NormalTok"/>
+        </w:rPr>
+        <w:t xml:space="preserve">(</w:t>
+      </w:r>
+      <w:r>
+        <w:rPr>
+          <w:rStyle w:val="AttributeTok"/>
+        </w:rPr>
+        <w:t xml:space="preserve">prop_gam =</w:t>
+      </w:r>
+      <w:r>
+        <w:rPr>
+          <w:rStyle w:val="NormalTok"/>
+        </w:rPr>
+        <w:t xml:space="preserve"> </w:t>
+      </w:r>
+      <w:r>
+        <w:rPr>
+          <w:rStyle w:val="FunctionTok"/>
+        </w:rPr>
+        <w:t xml:space="preserve">sum</w:t>
+      </w:r>
+      <w:r>
+        <w:rPr>
+          <w:rStyle w:val="NormalTok"/>
+        </w:rPr>
+        <w:t xml:space="preserve">(prop_gam), </w:t>
+      </w:r>
+      <w:r>
+        <w:rPr>
+          <w:rStyle w:val="AttributeTok"/>
+        </w:rPr>
+        <w:t xml:space="preserve">.groups =</w:t>
+      </w:r>
+      <w:r>
+        <w:rPr>
+          <w:rStyle w:val="NormalTok"/>
+        </w:rPr>
+        <w:t xml:space="preserve"> </w:t>
+      </w:r>
+      <w:r>
+        <w:rPr>
+          <w:rStyle w:val="StringTok"/>
+        </w:rPr>
+        <w:t xml:space="preserve">"drop"</w:t>
+      </w:r>
+      <w:r>
+        <w:rPr>
+          <w:rStyle w:val="NormalTok"/>
+        </w:rPr>
+        <w:t xml:space="preserve">) </w:t>
+      </w:r>
+      <w:r>
+        <w:rPr>
+          <w:rStyle w:val="SpecialCharTok"/>
+        </w:rPr>
+        <w:t xml:space="preserve">|&gt;</w:t>
+      </w:r>
+      <w:r>
+        <w:br/>
+      </w:r>
+      <w:r>
+        <w:rPr>
+          <w:rStyle w:val="NormalTok"/>
+        </w:rPr>
+        <w:t xml:space="preserve">  </w:t>
+      </w:r>
+      <w:r>
+        <w:rPr>
+          <w:rStyle w:val="FunctionTok"/>
+        </w:rPr>
+        <w:t xml:space="preserve">pivot_wider</w:t>
+      </w:r>
+      <w:r>
+        <w:rPr>
+          <w:rStyle w:val="NormalTok"/>
+        </w:rPr>
+        <w:t xml:space="preserve">(</w:t>
+      </w:r>
+      <w:r>
+        <w:br/>
+      </w:r>
+      <w:r>
+        <w:rPr>
+          <w:rStyle w:val="NormalTok"/>
+        </w:rPr>
+        <w:t xml:space="preserve">    </w:t>
+      </w:r>
+      <w:r>
+        <w:rPr>
+          <w:rStyle w:val="AttributeTok"/>
+        </w:rPr>
+        <w:t xml:space="preserve">names_from =</w:t>
+      </w:r>
+      <w:r>
+        <w:rPr>
+          <w:rStyle w:val="NormalTok"/>
+        </w:rPr>
+        <w:t xml:space="preserve"> length_bin,</w:t>
+      </w:r>
+      <w:r>
+        <w:br/>
+      </w:r>
+      <w:r>
+        <w:rPr>
+          <w:rStyle w:val="NormalTok"/>
+        </w:rPr>
+        <w:t xml:space="preserve">    </w:t>
+      </w:r>
+      <w:r>
+        <w:rPr>
+          <w:rStyle w:val="AttributeTok"/>
+        </w:rPr>
+        <w:t xml:space="preserve">values_from =</w:t>
+      </w:r>
+      <w:r>
+        <w:rPr>
+          <w:rStyle w:val="NormalTok"/>
+        </w:rPr>
+        <w:t xml:space="preserve"> prop_gam,</w:t>
+      </w:r>
+      <w:r>
+        <w:br/>
+      </w:r>
+      <w:r>
+        <w:rPr>
+          <w:rStyle w:val="NormalTok"/>
+        </w:rPr>
+        <w:t xml:space="preserve">    </w:t>
+      </w:r>
+      <w:r>
+        <w:rPr>
+          <w:rStyle w:val="AttributeTok"/>
+        </w:rPr>
+        <w:t xml:space="preserve">values_fill =</w:t>
+      </w:r>
+      <w:r>
+        <w:rPr>
+          <w:rStyle w:val="NormalTok"/>
+        </w:rPr>
+        <w:t xml:space="preserve"> </w:t>
+      </w:r>
+      <w:r>
+        <w:rPr>
+          <w:rStyle w:val="DecValTok"/>
+        </w:rPr>
+        <w:t xml:space="preserve">0</w:t>
+      </w:r>
+      <w:r>
+        <w:br/>
+      </w:r>
+      <w:r>
+        <w:rPr>
+          <w:rStyle w:val="NormalTok"/>
+        </w:rPr>
+        <w:t xml:space="preserve">  )</w:t>
+      </w:r>
+      <w:r>
+        <w:br/>
+      </w:r>
+      <w:r>
+        <w:br/>
+      </w:r>
+      <w:r>
+        <w:rPr>
+          <w:rStyle w:val="NormalTok"/>
+        </w:rPr>
+        <w:t xml:space="preserve">ll1_n_by_year </w:t>
+      </w:r>
+      <w:r>
+        <w:rPr>
+          <w:rStyle w:val="OtherTok"/>
+        </w:rPr>
+        <w:t xml:space="preserve">&lt;-</w:t>
+      </w:r>
+      <w:r>
+        <w:rPr>
+          <w:rStyle w:val="NormalTok"/>
+        </w:rPr>
+        <w:t xml:space="preserve"> assessment_length_freq </w:t>
+      </w:r>
+      <w:r>
+        <w:rPr>
+          <w:rStyle w:val="SpecialCharTok"/>
+        </w:rPr>
+        <w:t xml:space="preserve">|&gt;</w:t>
+      </w:r>
+      <w:r>
+        <w:br/>
+      </w:r>
+      <w:r>
+        <w:rPr>
+          <w:rStyle w:val="NormalTok"/>
+        </w:rPr>
+        <w:t xml:space="preserve">  </w:t>
+      </w:r>
+      <w:r>
+        <w:rPr>
+          <w:rStyle w:val="FunctionTok"/>
+        </w:rPr>
+        <w:t xml:space="preserve">filter</w:t>
+      </w:r>
+      <w:r>
+        <w:rPr>
+          <w:rStyle w:val="NormalTok"/>
+        </w:rPr>
+        <w:t xml:space="preserve">(Fishery </w:t>
+      </w:r>
+      <w:r>
+        <w:rPr>
+          <w:rStyle w:val="SpecialCharTok"/>
+        </w:rPr>
+        <w:t xml:space="preserve">==</w:t>
+      </w:r>
+      <w:r>
+        <w:rPr>
+          <w:rStyle w:val="NormalTok"/>
+        </w:rPr>
+        <w:t xml:space="preserve"> </w:t>
+      </w:r>
+      <w:r>
+        <w:rPr>
+          <w:rStyle w:val="DecValTok"/>
+        </w:rPr>
+        <w:t xml:space="preserve">1</w:t>
+      </w:r>
+      <w:r>
+        <w:rPr>
+          <w:rStyle w:val="NormalTok"/>
+        </w:rPr>
+        <w:t xml:space="preserve">) </w:t>
+      </w:r>
+      <w:r>
+        <w:rPr>
+          <w:rStyle w:val="SpecialCharTok"/>
+        </w:rPr>
+        <w:t xml:space="preserve">|&gt;</w:t>
+      </w:r>
+      <w:r>
+        <w:br/>
+      </w:r>
+      <w:r>
+        <w:rPr>
+          <w:rStyle w:val="NormalTok"/>
+        </w:rPr>
+        <w:t xml:space="preserve">  </w:t>
+      </w:r>
+      <w:r>
+        <w:rPr>
+          <w:rStyle w:val="FunctionTok"/>
+        </w:rPr>
+        <w:t xml:space="preserve">distinct</w:t>
+      </w:r>
+      <w:r>
+        <w:rPr>
+          <w:rStyle w:val="NormalTok"/>
+        </w:rPr>
+        <w:t xml:space="preserve">(Year, N)</w:t>
+      </w:r>
+      <w:r>
+        <w:br/>
+      </w:r>
+      <w:r>
+        <w:br/>
+      </w:r>
+      <w:r>
+        <w:rPr>
+          <w:rStyle w:val="NormalTok"/>
+        </w:rPr>
+        <w:t xml:space="preserve">lf_gam_sbt_fishery </w:t>
+      </w:r>
+      <w:r>
+        <w:rPr>
+          <w:rStyle w:val="OtherTok"/>
+        </w:rPr>
+        <w:t xml:space="preserve">&lt;-</w:t>
+      </w:r>
+      <w:r>
+        <w:rPr>
+          <w:rStyle w:val="NormalTok"/>
+        </w:rPr>
+        <w:t xml:space="preserve"> lf_gam_sbt_wide </w:t>
+      </w:r>
+      <w:r>
+        <w:rPr>
+          <w:rStyle w:val="SpecialCharTok"/>
+        </w:rPr>
+        <w:t xml:space="preserve">|&gt;</w:t>
+      </w:r>
+      <w:r>
+        <w:br/>
+      </w:r>
+      <w:r>
+        <w:rPr>
+          <w:rStyle w:val="NormalTok"/>
+        </w:rPr>
+        <w:t xml:space="preserve">  </w:t>
+      </w:r>
+      <w:r>
+        <w:rPr>
+          <w:rStyle w:val="FunctionTok"/>
+        </w:rPr>
+        <w:t xml:space="preserve">rename</w:t>
+      </w:r>
+      <w:r>
+        <w:rPr>
+          <w:rStyle w:val="NormalTok"/>
+        </w:rPr>
+        <w:t xml:space="preserve">(</w:t>
+      </w:r>
+      <w:r>
+        <w:rPr>
+          <w:rStyle w:val="AttributeTok"/>
+        </w:rPr>
+        <w:t xml:space="preserve">Year =</w:t>
+      </w:r>
+      <w:r>
+        <w:rPr>
+          <w:rStyle w:val="NormalTok"/>
+        </w:rPr>
+        <w:t xml:space="preserve"> year) </w:t>
+      </w:r>
+      <w:r>
+        <w:rPr>
+          <w:rStyle w:val="SpecialCharTok"/>
+        </w:rPr>
+        <w:t xml:space="preserve">|&gt;</w:t>
+      </w:r>
+      <w:r>
+        <w:br/>
+      </w:r>
+      <w:r>
+        <w:rPr>
+          <w:rStyle w:val="NormalTok"/>
+        </w:rPr>
+        <w:t xml:space="preserve">  </w:t>
+      </w:r>
+      <w:r>
+        <w:rPr>
+          <w:rStyle w:val="FunctionTok"/>
+        </w:rPr>
+        <w:t xml:space="preserve">mutate</w:t>
+      </w:r>
+      <w:r>
+        <w:rPr>
+          <w:rStyle w:val="NormalTok"/>
+        </w:rPr>
+        <w:t xml:space="preserve">(</w:t>
+      </w:r>
+      <w:r>
+        <w:rPr>
+          <w:rStyle w:val="AttributeTok"/>
+        </w:rPr>
+        <w:t xml:space="preserve">Fishery =</w:t>
+      </w:r>
+      <w:r>
+        <w:rPr>
+          <w:rStyle w:val="NormalTok"/>
+        </w:rPr>
+        <w:t xml:space="preserve"> </w:t>
+      </w:r>
+      <w:r>
+        <w:rPr>
+          <w:rStyle w:val="DecValTok"/>
+        </w:rPr>
+        <w:t xml:space="preserve">1</w:t>
+      </w:r>
+      <w:r>
+        <w:rPr>
+          <w:rStyle w:val="NormalTok"/>
+        </w:rPr>
+        <w:t xml:space="preserve">L, </w:t>
+      </w:r>
+      <w:r>
+        <w:rPr>
+          <w:rStyle w:val="AttributeTok"/>
+        </w:rPr>
+        <w:t xml:space="preserve">.before =</w:t>
+      </w:r>
+      <w:r>
+        <w:rPr>
+          <w:rStyle w:val="NormalTok"/>
+        </w:rPr>
+        <w:t xml:space="preserve"> Year) </w:t>
+      </w:r>
+      <w:r>
+        <w:rPr>
+          <w:rStyle w:val="SpecialCharTok"/>
+        </w:rPr>
+        <w:t xml:space="preserve">|&gt;</w:t>
+      </w:r>
+      <w:r>
+        <w:br/>
+      </w:r>
+      <w:r>
+        <w:rPr>
+          <w:rStyle w:val="NormalTok"/>
+        </w:rPr>
+        <w:t xml:space="preserve">  </w:t>
+      </w:r>
+      <w:r>
+        <w:rPr>
+          <w:rStyle w:val="FunctionTok"/>
+        </w:rPr>
+        <w:t xml:space="preserve">left_join</w:t>
+      </w:r>
+      <w:r>
+        <w:rPr>
+          <w:rStyle w:val="NormalTok"/>
+        </w:rPr>
+        <w:t xml:space="preserve">(ll1_n_by_year, </w:t>
+      </w:r>
+      <w:r>
+        <w:rPr>
+          <w:rStyle w:val="AttributeTok"/>
+        </w:rPr>
+        <w:t xml:space="preserve">by =</w:t>
+      </w:r>
+      <w:r>
+        <w:rPr>
+          <w:rStyle w:val="NormalTok"/>
+        </w:rPr>
+        <w:t xml:space="preserve"> </w:t>
+      </w:r>
+      <w:r>
+        <w:rPr>
+          <w:rStyle w:val="StringTok"/>
+        </w:rPr>
+        <w:t xml:space="preserve">"Year"</w:t>
+      </w:r>
+      <w:r>
+        <w:rPr>
+          <w:rStyle w:val="NormalTok"/>
+        </w:rPr>
+        <w:t xml:space="preserve">) </w:t>
+      </w:r>
+      <w:r>
+        <w:rPr>
+          <w:rStyle w:val="SpecialCharTok"/>
+        </w:rPr>
+        <w:t xml:space="preserve">|&gt;</w:t>
+      </w:r>
+      <w:r>
+        <w:br/>
+      </w:r>
+      <w:r>
+        <w:rPr>
+          <w:rStyle w:val="NormalTok"/>
+        </w:rPr>
+        <w:t xml:space="preserve">  </w:t>
+      </w:r>
+      <w:r>
+        <w:rPr>
+          <w:rStyle w:val="FunctionTok"/>
+        </w:rPr>
+        <w:t xml:space="preserve">relocate</w:t>
+      </w:r>
+      <w:r>
+        <w:rPr>
+          <w:rStyle w:val="NormalTok"/>
+        </w:rPr>
+        <w:t xml:space="preserve">(N, </w:t>
+      </w:r>
+      <w:r>
+        <w:rPr>
+          <w:rStyle w:val="AttributeTok"/>
+        </w:rPr>
+        <w:t xml:space="preserve">.after =</w:t>
+      </w:r>
+      <w:r>
+        <w:rPr>
+          <w:rStyle w:val="NormalTok"/>
+        </w:rPr>
+        <w:t xml:space="preserve"> Year)</w:t>
+      </w:r>
+      <w:r>
+        <w:br/>
+      </w:r>
+      <w:r>
+        <w:br/>
+      </w:r>
+      <w:r>
+        <w:rPr>
+          <w:rStyle w:val="NormalTok"/>
+        </w:rPr>
+        <w:t xml:space="preserve">missing_bins </w:t>
+      </w:r>
+      <w:r>
+        <w:rPr>
+          <w:rStyle w:val="OtherTok"/>
+        </w:rPr>
+        <w:t xml:space="preserve">&lt;-</w:t>
+      </w:r>
+      <w:r>
+        <w:rPr>
+          <w:rStyle w:val="NormalTok"/>
+        </w:rPr>
+        <w:t xml:space="preserve"> </w:t>
+      </w:r>
+      <w:r>
+        <w:rPr>
+          <w:rStyle w:val="FunctionTok"/>
+        </w:rPr>
+        <w:t xml:space="preserve">setdiff</w:t>
+      </w:r>
+      <w:r>
+        <w:rPr>
+          <w:rStyle w:val="NormalTok"/>
+        </w:rPr>
+        <w:t xml:space="preserve">(sbt_length_bins, </w:t>
+      </w:r>
+      <w:r>
+        <w:rPr>
+          <w:rStyle w:val="FunctionTok"/>
+        </w:rPr>
+        <w:t xml:space="preserve">names</w:t>
+      </w:r>
+      <w:r>
+        <w:rPr>
+          <w:rStyle w:val="NormalTok"/>
+        </w:rPr>
+        <w:t xml:space="preserve">(lf_gam_sbt_fishery))</w:t>
+      </w:r>
+      <w:r>
+        <w:br/>
+      </w:r>
+      <w:r>
+        <w:rPr>
+          <w:rStyle w:val="NormalTok"/>
+        </w:rPr>
+        <w:t xml:space="preserve">lf_gam_sbt_fishery[missing_bins] </w:t>
+      </w:r>
+      <w:r>
+        <w:rPr>
+          <w:rStyle w:val="OtherTok"/>
+        </w:rPr>
+        <w:t xml:space="preserve">&lt;-</w:t>
+      </w:r>
+      <w:r>
+        <w:rPr>
+          <w:rStyle w:val="NormalTok"/>
+        </w:rPr>
+        <w:t xml:space="preserve"> </w:t>
+      </w:r>
+      <w:r>
+        <w:rPr>
+          <w:rStyle w:val="DecValTok"/>
+        </w:rPr>
+        <w:t xml:space="preserve">0</w:t>
+      </w:r>
+      <w:r>
+        <w:br/>
+      </w:r>
+      <w:r>
+        <w:rPr>
+          <w:rStyle w:val="NormalTok"/>
+        </w:rPr>
+        <w:t xml:space="preserve">lf_gam_sbt_fishery </w:t>
+      </w:r>
+      <w:r>
+        <w:rPr>
+          <w:rStyle w:val="OtherTok"/>
+        </w:rPr>
+        <w:t xml:space="preserve">&lt;-</w:t>
+      </w:r>
+      <w:r>
+        <w:rPr>
+          <w:rStyle w:val="NormalTok"/>
+        </w:rPr>
+        <w:t xml:space="preserve"> lf_gam_sbt_fishery </w:t>
+      </w:r>
+      <w:r>
+        <w:rPr>
+          <w:rStyle w:val="SpecialCharTok"/>
+        </w:rPr>
+        <w:t xml:space="preserve">|&gt;</w:t>
+      </w:r>
+      <w:r>
+        <w:br/>
+      </w:r>
+      <w:r>
+        <w:rPr>
+          <w:rStyle w:val="NormalTok"/>
+        </w:rPr>
+        <w:t xml:space="preserve">  </w:t>
+      </w:r>
+      <w:r>
+        <w:rPr>
+          <w:rStyle w:val="FunctionTok"/>
+        </w:rPr>
+        <w:t xml:space="preserve">select</w:t>
+      </w:r>
+      <w:r>
+        <w:rPr>
+          <w:rStyle w:val="NormalTok"/>
+        </w:rPr>
+        <w:t xml:space="preserve">(Fishery, Year, N, </w:t>
+      </w:r>
+      <w:r>
+        <w:rPr>
+          <w:rStyle w:val="FunctionTok"/>
+        </w:rPr>
+        <w:t xml:space="preserve">all_of</w:t>
+      </w:r>
+      <w:r>
+        <w:rPr>
+          <w:rStyle w:val="NormalTok"/>
+        </w:rPr>
+        <w:t xml:space="preserve">(sbt_length_bins)) </w:t>
+      </w:r>
+      <w:r>
+        <w:rPr>
+          <w:rStyle w:val="SpecialCharTok"/>
+        </w:rPr>
+        <w:t xml:space="preserve">|&gt;</w:t>
+      </w:r>
+      <w:r>
+        <w:br/>
+      </w:r>
+      <w:r>
+        <w:rPr>
+          <w:rStyle w:val="NormalTok"/>
+        </w:rPr>
+        <w:t xml:space="preserve">  </w:t>
+      </w:r>
+      <w:r>
+        <w:rPr>
+          <w:rStyle w:val="FunctionTok"/>
+        </w:rPr>
+        <w:t xml:space="preserve">arrange</w:t>
+      </w:r>
+      <w:r>
+        <w:rPr>
+          <w:rStyle w:val="NormalTok"/>
+        </w:rPr>
+        <w:t xml:space="preserve">(Fishery, Year)</w:t>
+      </w:r>
+      <w:r>
+        <w:br/>
+      </w:r>
+      <w:r>
+        <w:br/>
+      </w:r>
+      <w:r>
+        <w:rPr>
+          <w:rStyle w:val="FunctionTok"/>
+        </w:rPr>
+        <w:t xml:space="preserve">write_csv</w:t>
+      </w:r>
+      <w:r>
+        <w:rPr>
+          <w:rStyle w:val="NormalTok"/>
+        </w:rPr>
+        <w:t xml:space="preserve">(lf_gam_sbt_fishery, </w:t>
+      </w:r>
+      <w:r>
+        <w:rPr>
+          <w:rStyle w:val="FunctionTok"/>
+        </w:rPr>
+        <w:t xml:space="preserve">here</w:t>
+      </w:r>
+      <w:r>
+        <w:rPr>
+          <w:rStyle w:val="NormalTok"/>
+        </w:rPr>
+        <w:t xml:space="preserve">(</w:t>
+      </w:r>
+      <w:r>
+        <w:rPr>
+          <w:rStyle w:val="StringTok"/>
+        </w:rPr>
+        <w:t xml:space="preserve">"doc"</w:t>
+      </w:r>
+      <w:r>
+        <w:rPr>
+          <w:rStyle w:val="NormalTok"/>
+        </w:rPr>
+        <w:t xml:space="preserve">, </w:t>
+      </w:r>
+      <w:r>
+        <w:rPr>
+          <w:rStyle w:val="StringTok"/>
+        </w:rPr>
+        <w:t xml:space="preserve">"lf_gam_cpue_sbt_fishery_length_freq.csv"</w:t>
+      </w:r>
+      <w:r>
+        <w:rPr>
+          <w:rStyle w:val="NormalTok"/>
+        </w:rPr>
+        <w:t xml:space="preserve">))</w:t>
       </w:r>
       <w:r>
         <w:br/>
@@ -6449,6 +7406,28 @@
     </w:tbl>
     <w:p>
       <w:pPr>
+        <w:pStyle w:val="BodyText"/>
+      </w:pPr>
+      <w:r>
+        <w:t xml:space="preserve">The Figure 2 GAM CPUE length-frequency matrix is written in SBT fishery length-composition format as</w:t>
+      </w:r>
+      <w:r>
+        <w:t xml:space="preserve"> </w:t>
+      </w:r>
+      <w:hyperlink r:id="rId23">
+        <w:r>
+          <w:rPr>
+            <w:rStyle w:val="VerbatimChar"/>
+          </w:rPr>
+          <w:t xml:space="preserve">lf_gam_cpue_sbt_fishery_length_freq.csv</w:t>
+        </w:r>
+      </w:hyperlink>
+      <w:r>
+        <w:t xml:space="preserve">.</w:t>
+      </w:r>
+    </w:p>
+    <w:p>
+      <w:pPr>
         <w:pStyle w:val="SourceCode"/>
       </w:pPr>
       <w:r>
@@ -7173,7 +8152,7 @@
       <w:tr>
         <w:tc>
           <w:tcPr/>
-          <w:bookmarkStart w:id="26" w:name="fig-mod_lf"/>
+          <w:bookmarkStart w:id="27" w:name="fig-mod_lf"/>
           <w:p>
             <w:pPr>
               <w:pStyle w:val="Compact"/>
@@ -7184,18 +8163,18 @@
                 <wp:inline>
                   <wp:extent cx="5334000" cy="8534400"/>
                   <wp:effectExtent b="0" l="0" r="0" t="0"/>
-                  <wp:docPr descr="" title="" id="24" name="Picture"/>
+                  <wp:docPr descr="" title="" id="25" name="Picture"/>
                   <a:graphic>
                     <a:graphicData uri="http://schemas.openxmlformats.org/drawingml/2006/picture">
                       <pic:pic>
                         <pic:nvPicPr>
-                          <pic:cNvPr descr="NewLengthFreq_files/figure-docx/fig-mod_lf-1.png" id="25" name="Picture"/>
+                          <pic:cNvPr descr="NewLengthFreq_files/figure-docx/fig-mod_lf-1.png" id="26" name="Picture"/>
                           <pic:cNvPicPr>
                             <a:picLocks noChangeArrowheads="1" noChangeAspect="1"/>
                           </pic:cNvPicPr>
                         </pic:nvPicPr>
                         <pic:blipFill>
-                          <a:blip r:embed="rId23"/>
+                          <a:blip r:embed="rId24"/>
                           <a:stretch>
                             <a:fillRect/>
                           </a:stretch>
@@ -7235,13 +8214,13 @@
               <w:t xml:space="preserve">Figure 3: Length frequency matrix from the assessment model input.</w:t>
             </w:r>
           </w:p>
-          <w:bookmarkEnd w:id="26"/>
+          <w:bookmarkEnd w:id="27"/>
         </w:tc>
       </w:tr>
     </w:tbl>
-    <w:bookmarkEnd w:id="27"/>
     <w:bookmarkEnd w:id="28"/>
-    <w:bookmarkStart w:id="29" w:name="summary"/>
+    <w:bookmarkEnd w:id="29"/>
+    <w:bookmarkStart w:id="30" w:name="summary"/>
     <w:p>
       <w:pPr>
         <w:pStyle w:val="Heading1"/>
@@ -7265,7 +8244,7 @@
         </w:pict>
       </w:r>
     </w:p>
-    <w:bookmarkEnd w:id="29"/>
+    <w:bookmarkEnd w:id="30"/>
     <w:sectPr>
       <w:footnotePr>
         <w:numRestart w:val="eachSect"/>

</xml_diff>